<commit_message>
Fixed minor typo in worksheet title and updated app version to 1.0.49.
</commit_message>
<xml_diff>
--- a/worksheets/wordDocs/EigenValuesVectors_Investigation.docx
+++ b/worksheets/wordDocs/EigenValuesVectors_Investigation.docx
@@ -571,7 +571,17 @@
               <w:t>magnitude</w:t>
             </w:r>
             <w:r>
-              <w:t xml:space="preserve"> and orientation.</w:t>
+              <w:t xml:space="preserve"> and </w:t>
+            </w:r>
+            <w:r>
+              <w:rPr>
+                <w:b/>
+                <w:bCs/>
+              </w:rPr>
+              <w:t>orientation</w:t>
+            </w:r>
+            <w:r>
+              <w:t>.</w:t>
             </w:r>
             <w:r>
               <w:t xml:space="preserve"> Does the vector stay on the same line through the origin?</w:t>
@@ -669,15 +679,7 @@
                 <w:b/>
                 <w:bCs/>
               </w:rPr>
-              <w:t>2</w:t>
-            </w:r>
-            <w:r>
-              <w:rPr>
-                <w:rFonts w:ascii="Consolas" w:hAnsi="Consolas"/>
-                <w:b/>
-                <w:bCs/>
-              </w:rPr>
-              <w:t>D</w:t>
+              <w:t>2D</w:t>
             </w:r>
             <w:r>
               <w:t xml:space="preserve"> and keep the vector display mode set to </w:t>
@@ -700,10 +702,7 @@
               </w:numPr>
             </w:pPr>
             <w:r>
-              <w:t xml:space="preserve">Add the following vectors </w:t>
-            </w:r>
-            <w:r>
-              <w:t>(1, 1), (-1, 2), (1, -2) and (-2, -2)</w:t>
+              <w:t>Add the following vectors (1, 1), (-1, 2), (1, -2) and (-2, -2)</w:t>
             </w:r>
             <w:r>
               <w:br/>
@@ -842,10 +841,7 @@
               </w:numPr>
             </w:pPr>
             <w:r>
-              <w:t xml:space="preserve">Now delete the vectors, and replace with </w:t>
-            </w:r>
-            <w:r>
-              <w:t>(2, 1), (0, 2) and (-3, -1)</w:t>
+              <w:t>Now delete the vectors, and replace with (2, 1), (0, 2) and (-3, -1)</w:t>
             </w:r>
           </w:p>
           <w:p>
@@ -955,6 +951,9 @@
               <w:jc w:val="center"/>
             </w:pPr>
             <w:r>
+              <w:rPr>
+                <w:noProof/>
+              </w:rPr>
               <w:drawing>
                 <wp:inline distT="0" distB="0" distL="0" distR="0" wp14:anchorId="57A1D5C9" wp14:editId="18E35C7E">
                   <wp:extent cx="2406567" cy="2484408"/>
@@ -1002,7 +1001,15 @@
                 <w:b/>
                 <w:bCs/>
               </w:rPr>
-              <w:t>Eigenvalues</w:t>
+              <w:t>e</w:t>
+            </w:r>
+            <w:r>
+              <w:rPr>
+                <w:rFonts w:ascii="Consolas" w:hAnsi="Consolas"/>
+                <w:b/>
+                <w:bCs/>
+              </w:rPr>
+              <w:t>igenvalues</w:t>
             </w:r>
             <w:r>
               <w:t xml:space="preserve"> and </w:t>
@@ -1013,7 +1020,15 @@
                 <w:b/>
                 <w:bCs/>
               </w:rPr>
-              <w:t>Eigenvectors</w:t>
+              <w:t>e</w:t>
+            </w:r>
+            <w:r>
+              <w:rPr>
+                <w:rFonts w:ascii="Consolas" w:hAnsi="Consolas"/>
+                <w:b/>
+                <w:bCs/>
+              </w:rPr>
+              <w:t>igenvectors</w:t>
             </w:r>
             <w:r>
               <w:t xml:space="preserve">. </w:t>
@@ -1089,7 +1104,15 @@
                 <w:b/>
                 <w:bCs/>
               </w:rPr>
-              <w:t>Eigenspaces</w:t>
+              <w:t>e</w:t>
+            </w:r>
+            <w:r>
+              <w:rPr>
+                <w:rFonts w:ascii="Consolas" w:hAnsi="Consolas"/>
+                <w:b/>
+                <w:bCs/>
+              </w:rPr>
+              <w:t>igenspaces</w:t>
             </w:r>
             <w:r>
               <w:t xml:space="preserve"> for the matrix. </w:t>
@@ -2633,6 +2656,7 @@
   <w:style w:type="character" w:default="1" w:styleId="DefaultParagraphFont">
     <w:name w:val="Default Paragraph Font"/>
     <w:uiPriority w:val="1"/>
+    <w:semiHidden/>
     <w:unhideWhenUsed/>
   </w:style>
   <w:style w:type="table" w:default="1" w:styleId="TableNormal">

</xml_diff>